<commit_message>
Update - S26 Calendar
</commit_message>
<xml_diff>
--- a/calendars/S26-Stat216_Calendar.docx
+++ b/calendars/S26-Stat216_Calendar.docx
@@ -1365,7 +1365,34 @@
                 <w:sz w:val="24"/>
                 <w:szCs w:val="24"/>
               </w:rPr>
-              <w:t>P. 4 – 8, P. 23 - 26</w:t>
+              <w:t>P. 4 – 8, P. 2</w:t>
+            </w:r>
+            <w:r>
+              <w:rPr>
+                <w:rFonts w:ascii="Times New Roman" w:hAnsi="Times New Roman" w:cs="Times New Roman"/>
+                <w:color w:val="4472C4" w:themeColor="accent5"/>
+                <w:sz w:val="24"/>
+                <w:szCs w:val="24"/>
+              </w:rPr>
+              <w:t>4</w:t>
+            </w:r>
+            <w:r>
+              <w:rPr>
+                <w:rFonts w:ascii="Times New Roman" w:hAnsi="Times New Roman" w:cs="Times New Roman"/>
+                <w:color w:val="4472C4" w:themeColor="accent5"/>
+                <w:sz w:val="24"/>
+                <w:szCs w:val="24"/>
+              </w:rPr>
+              <w:t xml:space="preserve"> - 2</w:t>
+            </w:r>
+            <w:r>
+              <w:rPr>
+                <w:rFonts w:ascii="Times New Roman" w:hAnsi="Times New Roman" w:cs="Times New Roman"/>
+                <w:color w:val="4472C4" w:themeColor="accent5"/>
+                <w:sz w:val="24"/>
+                <w:szCs w:val="24"/>
+              </w:rPr>
+              <w:t>7</w:t>
             </w:r>
           </w:p>
         </w:tc>
@@ -2364,7 +2391,34 @@
                 <w:sz w:val="24"/>
                 <w:szCs w:val="24"/>
               </w:rPr>
-              <w:t>P. 69 - 75</w:t>
+              <w:t xml:space="preserve">P. </w:t>
+            </w:r>
+            <w:r>
+              <w:rPr>
+                <w:rFonts w:ascii="Times New Roman" w:hAnsi="Times New Roman" w:cs="Times New Roman"/>
+                <w:color w:val="4472C4" w:themeColor="accent5"/>
+                <w:sz w:val="24"/>
+                <w:szCs w:val="24"/>
+              </w:rPr>
+              <w:t xml:space="preserve">70 </w:t>
+            </w:r>
+            <w:r>
+              <w:rPr>
+                <w:rFonts w:ascii="Times New Roman" w:hAnsi="Times New Roman" w:cs="Times New Roman"/>
+                <w:color w:val="4472C4" w:themeColor="accent5"/>
+                <w:sz w:val="24"/>
+                <w:szCs w:val="24"/>
+              </w:rPr>
+              <w:t>- 7</w:t>
+            </w:r>
+            <w:r>
+              <w:rPr>
+                <w:rFonts w:ascii="Times New Roman" w:hAnsi="Times New Roman" w:cs="Times New Roman"/>
+                <w:color w:val="4472C4" w:themeColor="accent5"/>
+                <w:sz w:val="24"/>
+                <w:szCs w:val="24"/>
+              </w:rPr>
+              <w:t>6</w:t>
             </w:r>
           </w:p>
         </w:tc>
@@ -3774,7 +3828,34 @@
                 <w:sz w:val="24"/>
                 <w:szCs w:val="24"/>
               </w:rPr>
-              <w:t>P. 116 - 127</w:t>
+              <w:t>P. 11</w:t>
+            </w:r>
+            <w:r>
+              <w:rPr>
+                <w:rFonts w:ascii="Times New Roman" w:hAnsi="Times New Roman" w:cs="Times New Roman"/>
+                <w:color w:val="4472C4" w:themeColor="accent5"/>
+                <w:sz w:val="24"/>
+                <w:szCs w:val="24"/>
+              </w:rPr>
+              <w:t xml:space="preserve">4 </w:t>
+            </w:r>
+            <w:r>
+              <w:rPr>
+                <w:rFonts w:ascii="Times New Roman" w:hAnsi="Times New Roman" w:cs="Times New Roman"/>
+                <w:color w:val="4472C4" w:themeColor="accent5"/>
+                <w:sz w:val="24"/>
+                <w:szCs w:val="24"/>
+              </w:rPr>
+              <w:t>- 12</w:t>
+            </w:r>
+            <w:r>
+              <w:rPr>
+                <w:rFonts w:ascii="Times New Roman" w:hAnsi="Times New Roman" w:cs="Times New Roman"/>
+                <w:color w:val="4472C4" w:themeColor="accent5"/>
+                <w:sz w:val="24"/>
+                <w:szCs w:val="24"/>
+              </w:rPr>
+              <w:t>5</w:t>
             </w:r>
           </w:p>
         </w:tc>
@@ -4138,7 +4219,34 @@
                 <w:sz w:val="24"/>
                 <w:szCs w:val="24"/>
               </w:rPr>
-              <w:t>P. 146 - 150</w:t>
+              <w:t>P. 14</w:t>
+            </w:r>
+            <w:r>
+              <w:rPr>
+                <w:rFonts w:ascii="Times New Roman" w:hAnsi="Times New Roman" w:cs="Times New Roman"/>
+                <w:color w:val="4472C4" w:themeColor="accent5"/>
+                <w:sz w:val="24"/>
+                <w:szCs w:val="24"/>
+              </w:rPr>
+              <w:t>4</w:t>
+            </w:r>
+            <w:r>
+              <w:rPr>
+                <w:rFonts w:ascii="Times New Roman" w:hAnsi="Times New Roman" w:cs="Times New Roman"/>
+                <w:color w:val="4472C4" w:themeColor="accent5"/>
+                <w:sz w:val="24"/>
+                <w:szCs w:val="24"/>
+              </w:rPr>
+              <w:t xml:space="preserve"> - 1</w:t>
+            </w:r>
+            <w:r>
+              <w:rPr>
+                <w:rFonts w:ascii="Times New Roman" w:hAnsi="Times New Roman" w:cs="Times New Roman"/>
+                <w:color w:val="4472C4" w:themeColor="accent5"/>
+                <w:sz w:val="24"/>
+                <w:szCs w:val="24"/>
+              </w:rPr>
+              <w:t>48</w:t>
             </w:r>
           </w:p>
         </w:tc>
@@ -4840,7 +4948,34 @@
                 <w:sz w:val="24"/>
                 <w:szCs w:val="24"/>
               </w:rPr>
-              <w:t>P. 172 - 189</w:t>
+              <w:t>P. 17</w:t>
+            </w:r>
+            <w:r>
+              <w:rPr>
+                <w:rFonts w:ascii="Times New Roman" w:hAnsi="Times New Roman" w:cs="Times New Roman"/>
+                <w:color w:val="4472C4" w:themeColor="accent5"/>
+                <w:sz w:val="24"/>
+                <w:szCs w:val="24"/>
+              </w:rPr>
+              <w:t xml:space="preserve">0 </w:t>
+            </w:r>
+            <w:r>
+              <w:rPr>
+                <w:rFonts w:ascii="Times New Roman" w:hAnsi="Times New Roman" w:cs="Times New Roman"/>
+                <w:color w:val="4472C4" w:themeColor="accent5"/>
+                <w:sz w:val="24"/>
+                <w:szCs w:val="24"/>
+              </w:rPr>
+              <w:t>- 18</w:t>
+            </w:r>
+            <w:r>
+              <w:rPr>
+                <w:rFonts w:ascii="Times New Roman" w:hAnsi="Times New Roman" w:cs="Times New Roman"/>
+                <w:color w:val="4472C4" w:themeColor="accent5"/>
+                <w:sz w:val="24"/>
+                <w:szCs w:val="24"/>
+              </w:rPr>
+              <w:t>7</w:t>
             </w:r>
           </w:p>
         </w:tc>
@@ -5448,7 +5583,34 @@
                 <w:sz w:val="24"/>
                 <w:szCs w:val="24"/>
               </w:rPr>
-              <w:t>P. 212 - 216</w:t>
+              <w:t>P. 21</w:t>
+            </w:r>
+            <w:r>
+              <w:rPr>
+                <w:rFonts w:ascii="Times New Roman" w:hAnsi="Times New Roman" w:cs="Times New Roman"/>
+                <w:color w:val="4472C4" w:themeColor="accent5"/>
+                <w:sz w:val="24"/>
+                <w:szCs w:val="24"/>
+              </w:rPr>
+              <w:t>0</w:t>
+            </w:r>
+            <w:r>
+              <w:rPr>
+                <w:rFonts w:ascii="Times New Roman" w:hAnsi="Times New Roman" w:cs="Times New Roman"/>
+                <w:color w:val="4472C4" w:themeColor="accent5"/>
+                <w:sz w:val="24"/>
+                <w:szCs w:val="24"/>
+              </w:rPr>
+              <w:t xml:space="preserve"> - 21</w:t>
+            </w:r>
+            <w:r>
+              <w:rPr>
+                <w:rFonts w:ascii="Times New Roman" w:hAnsi="Times New Roman" w:cs="Times New Roman"/>
+                <w:color w:val="4472C4" w:themeColor="accent5"/>
+                <w:sz w:val="24"/>
+                <w:szCs w:val="24"/>
+              </w:rPr>
+              <w:t>4</w:t>
             </w:r>
           </w:p>
         </w:tc>
@@ -6742,7 +6904,34 @@
                 <w:sz w:val="24"/>
                 <w:szCs w:val="24"/>
               </w:rPr>
-              <w:t>P. 252 - 260</w:t>
+              <w:t>P. 25</w:t>
+            </w:r>
+            <w:r>
+              <w:rPr>
+                <w:rFonts w:ascii="Times New Roman" w:hAnsi="Times New Roman" w:cs="Times New Roman"/>
+                <w:color w:val="4472C4" w:themeColor="accent5"/>
+                <w:sz w:val="24"/>
+                <w:szCs w:val="24"/>
+              </w:rPr>
+              <w:t>0</w:t>
+            </w:r>
+            <w:r>
+              <w:rPr>
+                <w:rFonts w:ascii="Times New Roman" w:hAnsi="Times New Roman" w:cs="Times New Roman"/>
+                <w:color w:val="4472C4" w:themeColor="accent5"/>
+                <w:sz w:val="24"/>
+                <w:szCs w:val="24"/>
+              </w:rPr>
+              <w:t xml:space="preserve"> - 2</w:t>
+            </w:r>
+            <w:r>
+              <w:rPr>
+                <w:rFonts w:ascii="Times New Roman" w:hAnsi="Times New Roman" w:cs="Times New Roman"/>
+                <w:color w:val="4472C4" w:themeColor="accent5"/>
+                <w:sz w:val="24"/>
+                <w:szCs w:val="24"/>
+              </w:rPr>
+              <w:t>58</w:t>
             </w:r>
           </w:p>
         </w:tc>
@@ -7104,18 +7293,7 @@
                 <w:szCs w:val="24"/>
                 <w:highlight w:val="yellow"/>
               </w:rPr>
-              <w:t xml:space="preserve">– </w:t>
-            </w:r>
-            <w:r>
-              <w:rPr>
-                <w:rFonts w:ascii="Times New Roman" w:eastAsia="Times New Roman" w:hAnsi="Times New Roman" w:cs="Times New Roman"/>
-                <w:b/>
-                <w:bCs/>
-                <w:sz w:val="24"/>
-                <w:szCs w:val="24"/>
-                <w:highlight w:val="yellow"/>
-              </w:rPr>
-              <w:t>University Day</w:t>
+              <w:t>– University Day</w:t>
             </w:r>
           </w:p>
           <w:p>
@@ -7532,7 +7710,25 @@
                 <w:sz w:val="24"/>
                 <w:szCs w:val="24"/>
               </w:rPr>
-              <w:t>Activity 19: Moneyball – Linear Regression</w:t>
+              <w:t xml:space="preserve">Activity 19: </w:t>
+            </w:r>
+            <w:r>
+              <w:rPr>
+                <w:rFonts w:ascii="Times New Roman" w:hAnsi="Times New Roman" w:cs="Times New Roman"/>
+                <w:iCs/>
+                <w:sz w:val="24"/>
+                <w:szCs w:val="24"/>
+              </w:rPr>
+              <w:t xml:space="preserve">IPEDS (continued) </w:t>
+            </w:r>
+            <w:r>
+              <w:rPr>
+                <w:rFonts w:ascii="Times New Roman" w:hAnsi="Times New Roman" w:cs="Times New Roman"/>
+                <w:iCs/>
+                <w:sz w:val="24"/>
+                <w:szCs w:val="24"/>
+              </w:rPr>
+              <w:t>– Linear Regression</w:t>
             </w:r>
           </w:p>
         </w:tc>
@@ -7604,7 +7800,34 @@
                 <w:sz w:val="24"/>
                 <w:szCs w:val="24"/>
               </w:rPr>
-              <w:t>P. 281 - 298</w:t>
+              <w:t>P. 28</w:t>
+            </w:r>
+            <w:r>
+              <w:rPr>
+                <w:rFonts w:ascii="Times New Roman" w:hAnsi="Times New Roman" w:cs="Times New Roman"/>
+                <w:color w:val="4472C4" w:themeColor="accent5"/>
+                <w:sz w:val="24"/>
+                <w:szCs w:val="24"/>
+              </w:rPr>
+              <w:t>1</w:t>
+            </w:r>
+            <w:r>
+              <w:rPr>
+                <w:rFonts w:ascii="Times New Roman" w:hAnsi="Times New Roman" w:cs="Times New Roman"/>
+                <w:color w:val="4472C4" w:themeColor="accent5"/>
+                <w:sz w:val="24"/>
+                <w:szCs w:val="24"/>
+              </w:rPr>
+              <w:t xml:space="preserve"> - 29</w:t>
+            </w:r>
+            <w:r>
+              <w:rPr>
+                <w:rFonts w:ascii="Times New Roman" w:hAnsi="Times New Roman" w:cs="Times New Roman"/>
+                <w:color w:val="4472C4" w:themeColor="accent5"/>
+                <w:sz w:val="24"/>
+                <w:szCs w:val="24"/>
+              </w:rPr>
+              <w:t>8</w:t>
             </w:r>
           </w:p>
         </w:tc>
@@ -7740,16 +7963,6 @@
           </w:tcPr>
           <w:p>
             <w:pPr>
-              <w:ind w:left="5"/>
-              <w:rPr>
-                <w:rFonts w:ascii="Times New Roman" w:hAnsi="Times New Roman" w:cs="Times New Roman"/>
-                <w:sz w:val="24"/>
-                <w:szCs w:val="24"/>
-              </w:rPr>
-            </w:pPr>
-          </w:p>
-          <w:p>
-            <w:pPr>
               <w:ind w:left="5" w:right="107"/>
               <w:rPr>
                 <w:rFonts w:ascii="Times New Roman" w:hAnsi="Times New Roman" w:cs="Times New Roman"/>
@@ -7763,7 +7976,15 @@
                 <w:sz w:val="24"/>
                 <w:szCs w:val="24"/>
               </w:rPr>
-              <w:t>Activity 20: IPEDS (continued)</w:t>
+              <w:t xml:space="preserve">Activity 20: </w:t>
+            </w:r>
+            <w:r>
+              <w:rPr>
+                <w:rFonts w:ascii="Times New Roman" w:hAnsi="Times New Roman" w:cs="Times New Roman"/>
+                <w:sz w:val="24"/>
+                <w:szCs w:val="24"/>
+              </w:rPr>
+              <w:t>Penguins</w:t>
             </w:r>
           </w:p>
         </w:tc>
@@ -7930,7 +8151,15 @@
                 <w:sz w:val="24"/>
                 <w:szCs w:val="24"/>
               </w:rPr>
-              <w:t>Activity 21: Prediction of Crocodilian Body Size</w:t>
+              <w:t xml:space="preserve">Activity 21: </w:t>
+            </w:r>
+            <w:r>
+              <w:rPr>
+                <w:rFonts w:ascii="Times New Roman" w:hAnsi="Times New Roman" w:cs="Times New Roman"/>
+                <w:sz w:val="24"/>
+                <w:szCs w:val="24"/>
+              </w:rPr>
+              <w:t>Golf Driving Distance</w:t>
             </w:r>
           </w:p>
         </w:tc>
@@ -8324,7 +8553,34 @@
                 <w:sz w:val="24"/>
                 <w:szCs w:val="24"/>
               </w:rPr>
-              <w:t>P. 330 - 337</w:t>
+              <w:t>P. 33</w:t>
+            </w:r>
+            <w:r>
+              <w:rPr>
+                <w:rFonts w:ascii="Times New Roman" w:hAnsi="Times New Roman" w:cs="Times New Roman"/>
+                <w:color w:val="4472C4" w:themeColor="accent5"/>
+                <w:sz w:val="24"/>
+                <w:szCs w:val="24"/>
+              </w:rPr>
+              <w:t>1</w:t>
+            </w:r>
+            <w:r>
+              <w:rPr>
+                <w:rFonts w:ascii="Times New Roman" w:hAnsi="Times New Roman" w:cs="Times New Roman"/>
+                <w:color w:val="4472C4" w:themeColor="accent5"/>
+                <w:sz w:val="24"/>
+                <w:szCs w:val="24"/>
+              </w:rPr>
+              <w:t xml:space="preserve"> - 33</w:t>
+            </w:r>
+            <w:r>
+              <w:rPr>
+                <w:rFonts w:ascii="Times New Roman" w:hAnsi="Times New Roman" w:cs="Times New Roman"/>
+                <w:color w:val="4472C4" w:themeColor="accent5"/>
+                <w:sz w:val="24"/>
+                <w:szCs w:val="24"/>
+              </w:rPr>
+              <w:t>8</w:t>
             </w:r>
           </w:p>
         </w:tc>
@@ -10799,6 +11055,21 @@
 </file>
 
 <file path=customXml/item1.xml><?xml version="1.0" encoding="utf-8"?>
+<?mso-contentType ?>
+<FormTemplates xmlns="http://schemas.microsoft.com/sharepoint/v3/contenttype/forms">
+  <Display>DocumentLibraryForm</Display>
+  <Edit>DocumentLibraryForm</Edit>
+  <New>DocumentLibraryForm</New>
+</FormTemplates>
+</file>
+
+<file path=customXml/item2.xml><?xml version="1.0" encoding="utf-8"?>
+<p:properties xmlns:p="http://schemas.microsoft.com/office/2006/metadata/properties" xmlns:xsi="http://www.w3.org/2001/XMLSchema-instance" xmlns:pc="http://schemas.microsoft.com/office/infopath/2007/PartnerControls">
+  <documentManagement/>
+</p:properties>
+</file>
+
+<file path=customXml/item3.xml><?xml version="1.0" encoding="utf-8"?>
 <ct:contentTypeSchema xmlns:ct="http://schemas.microsoft.com/office/2006/metadata/contentType" xmlns:ma="http://schemas.microsoft.com/office/2006/metadata/properties/metaAttributes" ct:_="" ma:_="" ma:contentTypeName="Document" ma:contentTypeID="0x010100CC03F583B8FC7D479BB917DCC50A759A" ma:contentTypeVersion="2" ma:contentTypeDescription="Create a new document." ma:contentTypeScope="" ma:versionID="a416b87cb6da220f553d25b31c6d1561">
   <xsd:schema xmlns:xsd="http://www.w3.org/2001/XMLSchema" xmlns:xs="http://www.w3.org/2001/XMLSchema" xmlns:p="http://schemas.microsoft.com/office/2006/metadata/properties" xmlns:ns2="7a494ea9-5c76-4b6d-9fd1-0b14ddec65d9" targetNamespace="http://schemas.microsoft.com/office/2006/metadata/properties" ma:root="true" ma:fieldsID="5848f5ec45c4ce39acac4a9febeb8d96" ns2:_="">
     <xsd:import namespace="7a494ea9-5c76-4b6d-9fd1-0b14ddec65d9"/>
@@ -10930,22 +11201,24 @@
 </ct:contentTypeSchema>
 </file>
 
-<file path=customXml/item2.xml><?xml version="1.0" encoding="utf-8"?>
-<p:properties xmlns:p="http://schemas.microsoft.com/office/2006/metadata/properties" xmlns:xsi="http://www.w3.org/2001/XMLSchema-instance" xmlns:pc="http://schemas.microsoft.com/office/infopath/2007/PartnerControls">
-  <documentManagement/>
-</p:properties>
+<file path=customXml/itemProps1.xml><?xml version="1.0" encoding="utf-8"?>
+<ds:datastoreItem xmlns:ds="http://schemas.openxmlformats.org/officeDocument/2006/customXml" ds:itemID="{73898C2B-C96D-434F-A1B6-6069F656FA6D}">
+  <ds:schemaRefs>
+    <ds:schemaRef ds:uri="http://schemas.microsoft.com/sharepoint/v3/contenttype/forms"/>
+  </ds:schemaRefs>
+</ds:datastoreItem>
 </file>
 
-<file path=customXml/item3.xml><?xml version="1.0" encoding="utf-8"?>
-<?mso-contentType ?>
-<FormTemplates xmlns="http://schemas.microsoft.com/sharepoint/v3/contenttype/forms">
-  <Display>DocumentLibraryForm</Display>
-  <Edit>DocumentLibraryForm</Edit>
-  <New>DocumentLibraryForm</New>
-</FormTemplates>
+<file path=customXml/itemProps2.xml><?xml version="1.0" encoding="utf-8"?>
+<ds:datastoreItem xmlns:ds="http://schemas.openxmlformats.org/officeDocument/2006/customXml" ds:itemID="{36ACC8F3-6E63-4670-B73D-DE1280E8DB8D}">
+  <ds:schemaRefs>
+    <ds:schemaRef ds:uri="http://schemas.microsoft.com/office/2006/metadata/properties"/>
+    <ds:schemaRef ds:uri="http://schemas.microsoft.com/office/infopath/2007/PartnerControls"/>
+  </ds:schemaRefs>
+</ds:datastoreItem>
 </file>
 
-<file path=customXml/itemProps1.xml><?xml version="1.0" encoding="utf-8"?>
+<file path=customXml/itemProps3.xml><?xml version="1.0" encoding="utf-8"?>
 <ds:datastoreItem xmlns:ds="http://schemas.openxmlformats.org/officeDocument/2006/customXml" ds:itemID="{F5239868-B096-4B81-8FD1-0516D39E2D56}">
   <ds:schemaRefs>
     <ds:schemaRef ds:uri="http://schemas.microsoft.com/office/2006/metadata/contentType"/>
@@ -10961,21 +11234,4 @@
     <ds:schemaRef ds:uri="http://schemas.microsoft.com/internal/obd"/>
   </ds:schemaRefs>
 </ds:datastoreItem>
-</file>
-
-<file path=customXml/itemProps2.xml><?xml version="1.0" encoding="utf-8"?>
-<ds:datastoreItem xmlns:ds="http://schemas.openxmlformats.org/officeDocument/2006/customXml" ds:itemID="{36ACC8F3-6E63-4670-B73D-DE1280E8DB8D}">
-  <ds:schemaRefs>
-    <ds:schemaRef ds:uri="http://schemas.microsoft.com/office/2006/metadata/properties"/>
-    <ds:schemaRef ds:uri="http://schemas.microsoft.com/office/infopath/2007/PartnerControls"/>
-  </ds:schemaRefs>
-</ds:datastoreItem>
-</file>
-
-<file path=customXml/itemProps3.xml><?xml version="1.0" encoding="utf-8"?>
-<ds:datastoreItem xmlns:ds="http://schemas.openxmlformats.org/officeDocument/2006/customXml" ds:itemID="{73898C2B-C96D-434F-A1B6-6069F656FA6D}">
-  <ds:schemaRefs>
-    <ds:schemaRef ds:uri="http://schemas.microsoft.com/sharepoint/v3/contenttype/forms"/>
-  </ds:schemaRefs>
-</ds:datastoreItem>
 </file>
</xml_diff>

<commit_message>
Update to S26 Calendar
</commit_message>
<xml_diff>
--- a/calendars/S26-Stat216_Calendar.docx
+++ b/calendars/S26-Stat216_Calendar.docx
@@ -133,8 +133,20 @@
           <w:sz w:val="24"/>
           <w:szCs w:val="24"/>
         </w:rPr>
-        <w:t xml:space="preserve"> Gradescope</w:t>
+        <w:t xml:space="preserve"> </w:t>
       </w:r>
+      <w:proofErr w:type="spellStart"/>
+      <w:r>
+        <w:rPr>
+          <w:rFonts w:ascii="Times New Roman" w:hAnsi="Times New Roman" w:cs="Times New Roman"/>
+          <w:i/>
+          <w:iCs/>
+          <w:sz w:val="24"/>
+          <w:szCs w:val="24"/>
+        </w:rPr>
+        <w:t>Gradescope</w:t>
+      </w:r>
+      <w:proofErr w:type="spellEnd"/>
     </w:p>
     <w:p>
       <w:pPr>
@@ -1258,7 +1270,7 @@
                 <w:sz w:val="24"/>
                 <w:szCs w:val="24"/>
               </w:rPr>
-              <w:t xml:space="preserve"> (sampling?)</w:t>
+              <w:t xml:space="preserve"> </w:t>
             </w:r>
           </w:p>
         </w:tc>
@@ -5097,8 +5109,19 @@
                 <w:sz w:val="24"/>
                 <w:szCs w:val="24"/>
               </w:rPr>
-              <w:t xml:space="preserve"> 2.2to2.4, 4.1_TwoProp, 4.2_TwoProp, 4.4, 15.1, 15.2, RelativeRisk</w:t>
-            </w:r>
+              <w:t xml:space="preserve"> 2.2to2.4, 4.1_TwoProp, 4.2_TwoProp, 4.4, 15.1, 15.2, </w:t>
+            </w:r>
+            <w:proofErr w:type="spellStart"/>
+            <w:r>
+              <w:rPr>
+                <w:rFonts w:ascii="Times New Roman" w:hAnsi="Times New Roman" w:cs="Times New Roman"/>
+                <w:color w:val="00B050"/>
+                <w:sz w:val="24"/>
+                <w:szCs w:val="24"/>
+              </w:rPr>
+              <w:t>RelativeRisk</w:t>
+            </w:r>
+            <w:proofErr w:type="spellEnd"/>
           </w:p>
           <w:p>
             <w:pPr>
@@ -8836,13 +8859,23 @@
                 <w:sz w:val="24"/>
               </w:rPr>
             </w:pPr>
+            <w:proofErr w:type="spellStart"/>
             <w:r>
               <w:rPr>
                 <w:rFonts w:ascii="Times New Roman" w:hAnsi="Times New Roman" w:cs="Times New Roman"/>
                 <w:color w:val="00B050"/>
                 <w:sz w:val="24"/>
               </w:rPr>
-              <w:t>PairedData, 18.1and18.2, 18.3</w:t>
+              <w:t>PairedData</w:t>
+            </w:r>
+            <w:proofErr w:type="spellEnd"/>
+            <w:r>
+              <w:rPr>
+                <w:rFonts w:ascii="Times New Roman" w:hAnsi="Times New Roman" w:cs="Times New Roman"/>
+                <w:color w:val="00B050"/>
+                <w:sz w:val="24"/>
+              </w:rPr>
+              <w:t>, 18.1and18.2, 18.3</w:t>
             </w:r>
           </w:p>
           <w:p>
@@ -11409,6 +11442,21 @@
 </file>
 
 <file path=customXml/item1.xml><?xml version="1.0" encoding="utf-8"?>
+<p:properties xmlns:p="http://schemas.microsoft.com/office/2006/metadata/properties" xmlns:xsi="http://www.w3.org/2001/XMLSchema-instance" xmlns:pc="http://schemas.microsoft.com/office/infopath/2007/PartnerControls">
+  <documentManagement/>
+</p:properties>
+</file>
+
+<file path=customXml/item2.xml><?xml version="1.0" encoding="utf-8"?>
+<?mso-contentType ?>
+<FormTemplates xmlns="http://schemas.microsoft.com/sharepoint/v3/contenttype/forms">
+  <Display>DocumentLibraryForm</Display>
+  <Edit>DocumentLibraryForm</Edit>
+  <New>DocumentLibraryForm</New>
+</FormTemplates>
+</file>
+
+<file path=customXml/item3.xml><?xml version="1.0" encoding="utf-8"?>
 <ct:contentTypeSchema xmlns:ct="http://schemas.microsoft.com/office/2006/metadata/contentType" xmlns:ma="http://schemas.microsoft.com/office/2006/metadata/properties/metaAttributes" ct:_="" ma:_="" ma:contentTypeName="Document" ma:contentTypeID="0x010100CC03F583B8FC7D479BB917DCC50A759A" ma:contentTypeVersion="2" ma:contentTypeDescription="Create a new document." ma:contentTypeScope="" ma:versionID="a416b87cb6da220f553d25b31c6d1561">
   <xsd:schema xmlns:xsd="http://www.w3.org/2001/XMLSchema" xmlns:xs="http://www.w3.org/2001/XMLSchema" xmlns:p="http://schemas.microsoft.com/office/2006/metadata/properties" xmlns:ns2="7a494ea9-5c76-4b6d-9fd1-0b14ddec65d9" targetNamespace="http://schemas.microsoft.com/office/2006/metadata/properties" ma:root="true" ma:fieldsID="5848f5ec45c4ce39acac4a9febeb8d96" ns2:_="">
     <xsd:import namespace="7a494ea9-5c76-4b6d-9fd1-0b14ddec65d9"/>
@@ -11540,22 +11588,24 @@
 </ct:contentTypeSchema>
 </file>
 
-<file path=customXml/item2.xml><?xml version="1.0" encoding="utf-8"?>
-<?mso-contentType ?>
-<FormTemplates xmlns="http://schemas.microsoft.com/sharepoint/v3/contenttype/forms">
-  <Display>DocumentLibraryForm</Display>
-  <Edit>DocumentLibraryForm</Edit>
-  <New>DocumentLibraryForm</New>
-</FormTemplates>
+<file path=customXml/itemProps1.xml><?xml version="1.0" encoding="utf-8"?>
+<ds:datastoreItem xmlns:ds="http://schemas.openxmlformats.org/officeDocument/2006/customXml" ds:itemID="{36ACC8F3-6E63-4670-B73D-DE1280E8DB8D}">
+  <ds:schemaRefs>
+    <ds:schemaRef ds:uri="http://schemas.microsoft.com/office/2006/metadata/properties"/>
+    <ds:schemaRef ds:uri="http://schemas.microsoft.com/office/infopath/2007/PartnerControls"/>
+  </ds:schemaRefs>
+</ds:datastoreItem>
 </file>
 
-<file path=customXml/item3.xml><?xml version="1.0" encoding="utf-8"?>
-<p:properties xmlns:p="http://schemas.microsoft.com/office/2006/metadata/properties" xmlns:xsi="http://www.w3.org/2001/XMLSchema-instance" xmlns:pc="http://schemas.microsoft.com/office/infopath/2007/PartnerControls">
-  <documentManagement/>
-</p:properties>
+<file path=customXml/itemProps2.xml><?xml version="1.0" encoding="utf-8"?>
+<ds:datastoreItem xmlns:ds="http://schemas.openxmlformats.org/officeDocument/2006/customXml" ds:itemID="{73898C2B-C96D-434F-A1B6-6069F656FA6D}">
+  <ds:schemaRefs>
+    <ds:schemaRef ds:uri="http://schemas.microsoft.com/sharepoint/v3/contenttype/forms"/>
+  </ds:schemaRefs>
+</ds:datastoreItem>
 </file>
 
-<file path=customXml/itemProps1.xml><?xml version="1.0" encoding="utf-8"?>
+<file path=customXml/itemProps3.xml><?xml version="1.0" encoding="utf-8"?>
 <ds:datastoreItem xmlns:ds="http://schemas.openxmlformats.org/officeDocument/2006/customXml" ds:itemID="{F5239868-B096-4B81-8FD1-0516D39E2D56}">
   <ds:schemaRefs>
     <ds:schemaRef ds:uri="http://schemas.microsoft.com/office/2006/metadata/contentType"/>
@@ -11571,21 +11621,4 @@
     <ds:schemaRef ds:uri="http://schemas.microsoft.com/internal/obd"/>
   </ds:schemaRefs>
 </ds:datastoreItem>
-</file>
-
-<file path=customXml/itemProps2.xml><?xml version="1.0" encoding="utf-8"?>
-<ds:datastoreItem xmlns:ds="http://schemas.openxmlformats.org/officeDocument/2006/customXml" ds:itemID="{73898C2B-C96D-434F-A1B6-6069F656FA6D}">
-  <ds:schemaRefs>
-    <ds:schemaRef ds:uri="http://schemas.microsoft.com/sharepoint/v3/contenttype/forms"/>
-  </ds:schemaRefs>
-</ds:datastoreItem>
-</file>
-
-<file path=customXml/itemProps3.xml><?xml version="1.0" encoding="utf-8"?>
-<ds:datastoreItem xmlns:ds="http://schemas.openxmlformats.org/officeDocument/2006/customXml" ds:itemID="{36ACC8F3-6E63-4670-B73D-DE1280E8DB8D}">
-  <ds:schemaRefs>
-    <ds:schemaRef ds:uri="http://schemas.microsoft.com/office/2006/metadata/properties"/>
-    <ds:schemaRef ds:uri="http://schemas.microsoft.com/office/infopath/2007/PartnerControls"/>
-  </ds:schemaRefs>
-</ds:datastoreItem>
 </file>
</xml_diff>

<commit_message>
Remove video quizzes from S26 calendar
</commit_message>
<xml_diff>
--- a/calendars/S26-Stat216_Calendar.docx
+++ b/calendars/S26-Stat216_Calendar.docx
@@ -103,7 +103,7 @@
           <w:sz w:val="24"/>
           <w:szCs w:val="24"/>
         </w:rPr>
-        <w:t>s, labs, and video quizzes</w:t>
+        <w:t xml:space="preserve">s, labs, and </w:t>
       </w:r>
       <w:r>
         <w:rPr>
@@ -113,7 +113,17 @@
           <w:sz w:val="24"/>
           <w:szCs w:val="24"/>
         </w:rPr>
-        <w:t xml:space="preserve"> should be </w:t>
+        <w:t xml:space="preserve">exit tickets </w:t>
+      </w:r>
+      <w:r>
+        <w:rPr>
+          <w:rFonts w:ascii="Times New Roman" w:hAnsi="Times New Roman" w:cs="Times New Roman"/>
+          <w:i/>
+          <w:iCs/>
+          <w:sz w:val="24"/>
+          <w:szCs w:val="24"/>
+        </w:rPr>
+        <w:t xml:space="preserve">should be </w:t>
       </w:r>
       <w:r>
         <w:rPr>
@@ -133,20 +143,8 @@
           <w:sz w:val="24"/>
           <w:szCs w:val="24"/>
         </w:rPr>
-        <w:t xml:space="preserve"> </w:t>
+        <w:t xml:space="preserve"> Gradescope</w:t>
       </w:r>
-      <w:proofErr w:type="spellStart"/>
-      <w:r>
-        <w:rPr>
-          <w:rFonts w:ascii="Times New Roman" w:hAnsi="Times New Roman" w:cs="Times New Roman"/>
-          <w:i/>
-          <w:iCs/>
-          <w:sz w:val="24"/>
-          <w:szCs w:val="24"/>
-        </w:rPr>
-        <w:t>Gradescope</w:t>
-      </w:r>
-      <w:proofErr w:type="spellEnd"/>
     </w:p>
     <w:p>
       <w:pPr>
@@ -5109,19 +5107,8 @@
                 <w:sz w:val="24"/>
                 <w:szCs w:val="24"/>
               </w:rPr>
-              <w:t xml:space="preserve"> 2.2to2.4, 4.1_TwoProp, 4.2_TwoProp, 4.4, 15.1, 15.2, </w:t>
-            </w:r>
-            <w:proofErr w:type="spellStart"/>
-            <w:r>
-              <w:rPr>
-                <w:rFonts w:ascii="Times New Roman" w:hAnsi="Times New Roman" w:cs="Times New Roman"/>
-                <w:color w:val="00B050"/>
-                <w:sz w:val="24"/>
-                <w:szCs w:val="24"/>
-              </w:rPr>
-              <w:t>RelativeRisk</w:t>
-            </w:r>
-            <w:proofErr w:type="spellEnd"/>
+              <w:t xml:space="preserve"> 2.2to2.4, 4.1_TwoProp, 4.2_TwoProp, 4.4, 15.1, 15.2, RelativeRisk</w:t>
+            </w:r>
           </w:p>
           <w:p>
             <w:pPr>
@@ -8859,23 +8846,13 @@
                 <w:sz w:val="24"/>
               </w:rPr>
             </w:pPr>
-            <w:proofErr w:type="spellStart"/>
             <w:r>
               <w:rPr>
                 <w:rFonts w:ascii="Times New Roman" w:hAnsi="Times New Roman" w:cs="Times New Roman"/>
                 <w:color w:val="00B050"/>
                 <w:sz w:val="24"/>
               </w:rPr>
-              <w:t>PairedData</w:t>
-            </w:r>
-            <w:proofErr w:type="spellEnd"/>
-            <w:r>
-              <w:rPr>
-                <w:rFonts w:ascii="Times New Roman" w:hAnsi="Times New Roman" w:cs="Times New Roman"/>
-                <w:color w:val="00B050"/>
-                <w:sz w:val="24"/>
-              </w:rPr>
-              <w:t>, 18.1and18.2, 18.3</w:t>
+              <w:t>PairedData, 18.1and18.2, 18.3</w:t>
             </w:r>
           </w:p>
           <w:p>
@@ -11442,18 +11419,18 @@
 </file>
 
 <file path=customXml/item1.xml><?xml version="1.0" encoding="utf-8"?>
-<p:properties xmlns:p="http://schemas.microsoft.com/office/2006/metadata/properties" xmlns:xsi="http://www.w3.org/2001/XMLSchema-instance" xmlns:pc="http://schemas.microsoft.com/office/infopath/2007/PartnerControls">
-  <documentManagement/>
-</p:properties>
-</file>
-
-<file path=customXml/item2.xml><?xml version="1.0" encoding="utf-8"?>
 <?mso-contentType ?>
 <FormTemplates xmlns="http://schemas.microsoft.com/sharepoint/v3/contenttype/forms">
   <Display>DocumentLibraryForm</Display>
   <Edit>DocumentLibraryForm</Edit>
   <New>DocumentLibraryForm</New>
 </FormTemplates>
+</file>
+
+<file path=customXml/item2.xml><?xml version="1.0" encoding="utf-8"?>
+<p:properties xmlns:p="http://schemas.microsoft.com/office/2006/metadata/properties" xmlns:xsi="http://www.w3.org/2001/XMLSchema-instance" xmlns:pc="http://schemas.microsoft.com/office/infopath/2007/PartnerControls">
+  <documentManagement/>
+</p:properties>
 </file>
 
 <file path=customXml/item3.xml><?xml version="1.0" encoding="utf-8"?>
@@ -11589,18 +11566,18 @@
 </file>
 
 <file path=customXml/itemProps1.xml><?xml version="1.0" encoding="utf-8"?>
-<ds:datastoreItem xmlns:ds="http://schemas.openxmlformats.org/officeDocument/2006/customXml" ds:itemID="{36ACC8F3-6E63-4670-B73D-DE1280E8DB8D}">
+<ds:datastoreItem xmlns:ds="http://schemas.openxmlformats.org/officeDocument/2006/customXml" ds:itemID="{73898C2B-C96D-434F-A1B6-6069F656FA6D}">
   <ds:schemaRefs>
-    <ds:schemaRef ds:uri="http://schemas.microsoft.com/office/2006/metadata/properties"/>
-    <ds:schemaRef ds:uri="http://schemas.microsoft.com/office/infopath/2007/PartnerControls"/>
+    <ds:schemaRef ds:uri="http://schemas.microsoft.com/sharepoint/v3/contenttype/forms"/>
   </ds:schemaRefs>
 </ds:datastoreItem>
 </file>
 
 <file path=customXml/itemProps2.xml><?xml version="1.0" encoding="utf-8"?>
-<ds:datastoreItem xmlns:ds="http://schemas.openxmlformats.org/officeDocument/2006/customXml" ds:itemID="{73898C2B-C96D-434F-A1B6-6069F656FA6D}">
+<ds:datastoreItem xmlns:ds="http://schemas.openxmlformats.org/officeDocument/2006/customXml" ds:itemID="{36ACC8F3-6E63-4670-B73D-DE1280E8DB8D}">
   <ds:schemaRefs>
-    <ds:schemaRef ds:uri="http://schemas.microsoft.com/sharepoint/v3/contenttype/forms"/>
+    <ds:schemaRef ds:uri="http://schemas.microsoft.com/office/2006/metadata/properties"/>
+    <ds:schemaRef ds:uri="http://schemas.microsoft.com/office/infopath/2007/PartnerControls"/>
   </ds:schemaRefs>
 </ds:datastoreItem>
 </file>

</xml_diff>

<commit_message>
S26 Final Exam Date added
</commit_message>
<xml_diff>
--- a/calendars/S26-Stat216_Calendar.docx
+++ b/calendars/S26-Stat216_Calendar.docx
@@ -10028,7 +10028,47 @@
                 <w:szCs w:val="24"/>
                 <w:highlight w:val="yellow"/>
               </w:rPr>
-              <w:t xml:space="preserve"> TBD, but plan for Thursday, May 7 from 6 – 8 pm</w:t>
+              <w:t xml:space="preserve"> Thursday, May 7 from </w:t>
+            </w:r>
+            <w:r>
+              <w:rPr>
+                <w:rFonts w:ascii="Times New Roman" w:eastAsia="Times New Roman" w:hAnsi="Times New Roman" w:cs="Times New Roman"/>
+                <w:b/>
+                <w:sz w:val="24"/>
+                <w:szCs w:val="24"/>
+                <w:highlight w:val="yellow"/>
+              </w:rPr>
+              <w:t>10</w:t>
+            </w:r>
+            <w:r>
+              <w:rPr>
+                <w:rFonts w:ascii="Times New Roman" w:eastAsia="Times New Roman" w:hAnsi="Times New Roman" w:cs="Times New Roman"/>
+                <w:b/>
+                <w:sz w:val="24"/>
+                <w:szCs w:val="24"/>
+                <w:highlight w:val="yellow"/>
+              </w:rPr>
+              <w:t xml:space="preserve"> – </w:t>
+            </w:r>
+            <w:r>
+              <w:rPr>
+                <w:rFonts w:ascii="Times New Roman" w:eastAsia="Times New Roman" w:hAnsi="Times New Roman" w:cs="Times New Roman"/>
+                <w:b/>
+                <w:sz w:val="24"/>
+                <w:szCs w:val="24"/>
+                <w:highlight w:val="yellow"/>
+              </w:rPr>
+              <w:t>11:50 a</w:t>
+            </w:r>
+            <w:r>
+              <w:rPr>
+                <w:rFonts w:ascii="Times New Roman" w:eastAsia="Times New Roman" w:hAnsi="Times New Roman" w:cs="Times New Roman"/>
+                <w:b/>
+                <w:sz w:val="24"/>
+                <w:szCs w:val="24"/>
+                <w:highlight w:val="yellow"/>
+              </w:rPr>
+              <w:t>m</w:t>
             </w:r>
           </w:p>
         </w:tc>
@@ -11419,18 +11459,18 @@
 </file>
 
 <file path=customXml/item1.xml><?xml version="1.0" encoding="utf-8"?>
+<p:properties xmlns:p="http://schemas.microsoft.com/office/2006/metadata/properties" xmlns:xsi="http://www.w3.org/2001/XMLSchema-instance" xmlns:pc="http://schemas.microsoft.com/office/infopath/2007/PartnerControls">
+  <documentManagement/>
+</p:properties>
+</file>
+
+<file path=customXml/item2.xml><?xml version="1.0" encoding="utf-8"?>
 <?mso-contentType ?>
 <FormTemplates xmlns="http://schemas.microsoft.com/sharepoint/v3/contenttype/forms">
   <Display>DocumentLibraryForm</Display>
   <Edit>DocumentLibraryForm</Edit>
   <New>DocumentLibraryForm</New>
 </FormTemplates>
-</file>
-
-<file path=customXml/item2.xml><?xml version="1.0" encoding="utf-8"?>
-<p:properties xmlns:p="http://schemas.microsoft.com/office/2006/metadata/properties" xmlns:xsi="http://www.w3.org/2001/XMLSchema-instance" xmlns:pc="http://schemas.microsoft.com/office/infopath/2007/PartnerControls">
-  <documentManagement/>
-</p:properties>
 </file>
 
 <file path=customXml/item3.xml><?xml version="1.0" encoding="utf-8"?>
@@ -11566,18 +11606,18 @@
 </file>
 
 <file path=customXml/itemProps1.xml><?xml version="1.0" encoding="utf-8"?>
-<ds:datastoreItem xmlns:ds="http://schemas.openxmlformats.org/officeDocument/2006/customXml" ds:itemID="{73898C2B-C96D-434F-A1B6-6069F656FA6D}">
+<ds:datastoreItem xmlns:ds="http://schemas.openxmlformats.org/officeDocument/2006/customXml" ds:itemID="{36ACC8F3-6E63-4670-B73D-DE1280E8DB8D}">
   <ds:schemaRefs>
-    <ds:schemaRef ds:uri="http://schemas.microsoft.com/sharepoint/v3/contenttype/forms"/>
+    <ds:schemaRef ds:uri="http://schemas.microsoft.com/office/2006/metadata/properties"/>
+    <ds:schemaRef ds:uri="http://schemas.microsoft.com/office/infopath/2007/PartnerControls"/>
   </ds:schemaRefs>
 </ds:datastoreItem>
 </file>
 
 <file path=customXml/itemProps2.xml><?xml version="1.0" encoding="utf-8"?>
-<ds:datastoreItem xmlns:ds="http://schemas.openxmlformats.org/officeDocument/2006/customXml" ds:itemID="{36ACC8F3-6E63-4670-B73D-DE1280E8DB8D}">
+<ds:datastoreItem xmlns:ds="http://schemas.openxmlformats.org/officeDocument/2006/customXml" ds:itemID="{73898C2B-C96D-434F-A1B6-6069F656FA6D}">
   <ds:schemaRefs>
-    <ds:schemaRef ds:uri="http://schemas.microsoft.com/office/2006/metadata/properties"/>
-    <ds:schemaRef ds:uri="http://schemas.microsoft.com/office/infopath/2007/PartnerControls"/>
+    <ds:schemaRef ds:uri="http://schemas.microsoft.com/sharepoint/v3/contenttype/forms"/>
   </ds:schemaRefs>
 </ds:datastoreItem>
 </file>

</xml_diff>